<commit_message>
docs: align model record with final methods
</commit_message>
<xml_diff>
--- a/模型优化记录final.docx
+++ b/模型优化记录final.docx
@@ -46,26 +46,18 @@
         </w:rPr>
       </w:pPr>
       <w:r>
-        <w:rPr>
-          <w:rFonts w:hint="eastAsia"/>
-          <w:lang w:val="en-US" w:eastAsia="zh-CN"/>
-        </w:rPr>
-        <w:t>6200 raw data 按经纬度聚合后独立坐标点，4485可用于实际训练的数据</w:t>
-      </w:r>
-    </w:p>
-    <w:p>
-      <w:pPr>
-        <w:rPr>
-          <w:rFonts w:hint="eastAsia"/>
-          <w:lang w:val="en-US" w:eastAsia="zh-CN"/>
-        </w:rPr>
-      </w:pPr>
-      <w:r>
-        <w:rPr>
-          <w:rFonts w:hint="eastAsia"/>
-          <w:lang w:val="en-US" w:eastAsia="zh-CN"/>
-        </w:rPr>
-        <w:t>outer 5fold &amp;inner 5fold  5x5交叉验证训练</w:t>
+        <w:t>6,283条原始观测按经纬度聚合并连接冻结预测因子后形成4,527个候选站点，其中4,485个站点满足complete-P0规则并进入Full50正式训练。</w:t>
+      </w:r>
+    </w:p>
+    <w:p>
+      <w:pPr>
+        <w:rPr>
+          <w:rFonts w:hint="eastAsia"/>
+          <w:lang w:val="en-US" w:eastAsia="zh-CN"/>
+        </w:rPr>
+      </w:pPr>
+      <w:r>
+        <w:t>Base V0采用5个Outer folds、每个Outer training内3个Inner folds；Base V1升级为3 repeats × 5 Outer folds，并在每个Outer training内使用5个Inner folds。</w:t>
       </w:r>
     </w:p>
     <w:p>
@@ -178,11 +170,7 @@
         </w:rPr>
       </w:pPr>
       <w:r>
-        <w:rPr>
-          <w:rFonts w:hint="eastAsia"/>
-          <w:lang w:val="en-US" w:eastAsia="zh-CN"/>
-        </w:rPr>
-        <w:t xml:space="preserve">前置RF 训练数据分组方式有500*500 1000*1000 1500*1500 reference，其中1000*1000为primary，其余为验证组；存在空间数据的信息泄露和空间以来问题  </w:t>
+        <w:t>Base V0设置500、1,000、1,500 km空间隔离和reference分组验证，其中1,000 km为Primary，其余为stress validation；这些设计用于诊断空间依赖和来源泛化，而不是500×500一类规则网格。</w:t>
       </w:r>
     </w:p>
     <w:p>
@@ -313,11 +301,7 @@
         </w:rPr>
       </w:pPr>
       <w:r>
-        <w:rPr>
-          <w:rFonts w:hint="eastAsia"/>
-          <w:lang w:val="en-US" w:eastAsia="zh-CN"/>
-        </w:rPr>
-        <w:t>扩大超参数搜索控价 从12 上升到 48，充分探索模型复杂度，检验局部拟合和跨水系平滑外推的平衡；replace纳入超参数搜索范围，增加样本随机性和树间差异；使用两阶段搜索代替完整笛卡尔积，降低计算量分阶段设置 tree num</w:t>
+        <w:t>将RF超参数搜索范围从Base V0的12组扩大到Base V1的48组，检验局部拟合与跨水系平滑外推的平衡；将replace纳入搜索，并使用两阶段搜索降低计算量。</w:t>
       </w:r>
     </w:p>
     <w:p>
@@ -4562,47 +4546,47 @@
         </w:rPr>
       </w:pPr>
       <w:r>
-        <w:rPr>
-          <w:rFonts w:hint="eastAsia"/>
-          <w:lang w:val="en-US" w:eastAsia="zh-CN"/>
-        </w:rPr>
-        <w:t>Oracle通过标准预先冻结为：</w:t>
-      </w:r>
-    </w:p>
-    <w:p>
-      <w:pPr>
-        <w:tabs>
-          <w:tab w:val="left" w:pos="697"/>
-        </w:tabs>
-        <w:rPr>
-          <w:rFonts w:hint="eastAsia"/>
-          <w:lang w:val="en-US" w:eastAsia="zh-CN"/>
-        </w:rPr>
-      </w:pPr>
-      <w:r>
-        <w:rPr>
-          <w:rFonts w:hint="eastAsia"/>
-          <w:lang w:val="en-US" w:eastAsia="zh-CN"/>
-        </w:rPr>
-        <w:t>相对 BasePred-only 的 hydrological-group macro MAE 改善 ≥5%</w:t>
-      </w:r>
-    </w:p>
-    <w:p>
-      <w:pPr>
-        <w:tabs>
-          <w:tab w:val="left" w:pos="697"/>
-        </w:tabs>
-        <w:rPr>
-          <w:rFonts w:hint="eastAsia"/>
-          <w:lang w:val="en-US" w:eastAsia="zh-CN"/>
-        </w:rPr>
-      </w:pPr>
-      <w:r>
-        <w:rPr>
-          <w:rFonts w:hint="eastAsia"/>
-          <w:lang w:val="en-US" w:eastAsia="zh-CN"/>
-        </w:rPr>
-        <w:t>至少2/3 repeats达到该标准    三次repeat平均改善为正</w:t>
+        <w:t>Correction Feasibility预先冻结两层通过标准：</w:t>
+      </w:r>
+    </w:p>
+    <w:p>
+      <w:pPr>
+        <w:tabs>
+          <w:tab w:val="left" w:pos="697"/>
+        </w:tabs>
+        <w:rPr>
+          <w:rFonts w:hint="eastAsia"/>
+          <w:lang w:val="en-US" w:eastAsia="zh-CN"/>
+        </w:rPr>
+      </w:pPr>
+      <w:r>
+        <w:t>Residual-signal Gate：相对同模型家族的BasePred-only correction，hydrological-group macro MAE改善≥5%。</w:t>
+      </w:r>
+    </w:p>
+    <w:p>
+      <w:pPr>
+        <w:tabs>
+          <w:tab w:val="left" w:pos="697"/>
+        </w:tabs>
+        <w:rPr>
+          <w:rFonts w:hint="eastAsia"/>
+          <w:lang w:val="en-US" w:eastAsia="zh-CN"/>
+        </w:rPr>
+      </w:pPr>
+      <w:r>
+        <w:t>Residual-signal Gate还要求至少2/3 repeats达到该标准，且三次repeat平均改善为正。</w:t>
+      </w:r>
+    </w:p>
+    <w:p>
+      <w:pPr/>
+      <w:r>
+        <w:t>Raw-Base Safety Gate：同一候选相对未修改的Raw Base，至少2/3 repeats不更差，且三次repeat平均improvement必须严格为正。</w:t>
+      </w:r>
+    </w:p>
+    <w:p>
+      <w:pPr/>
+      <w:r>
+        <w:t>Promotion要求同一候选同时通过Residual-signal Gate与Raw-Base Safety Gate；station-level或tail改善仅作诊断，不能覆盖group-macro安全失败。</w:t>
       </w:r>
     </w:p>
     <w:p>
@@ -5608,136 +5592,102 @@
         </w:rPr>
       </w:pPr>
       <w:r>
-        <w:rPr>
-          <w:rFonts w:hint="eastAsia"/>
-          <w:lang w:val="en-US" w:eastAsia="zh-CN"/>
-        </w:rPr>
-        <w:t>1）</w:t>
-      </w:r>
-      <w:r>
-        <w:rPr>
-          <w:rFonts w:hint="default"/>
-          <w:lang w:val="en-US" w:eastAsia="zh-CN"/>
-        </w:rPr>
-        <w:t xml:space="preserve">原 Base </w:t>
-      </w:r>
-      <w:r>
-        <w:rPr>
-          <w:rFonts w:hint="eastAsia"/>
-          <w:lang w:val="en-US" w:eastAsia="zh-CN"/>
-        </w:rPr>
-        <w:t>model</w:t>
-      </w:r>
-      <w:r>
-        <w:rPr>
-          <w:rFonts w:hint="default"/>
-          <w:lang w:val="en-US" w:eastAsia="zh-CN"/>
-        </w:rPr>
-        <w:t>一直用完整 terminal hydrological component 做分组验证，也就是测试某个水系时，整个连通大水系全部拿出训练集。最初这么做的逻辑是防止同一水系上下游信息泄漏，测试跨完整水系泛化。但在研究 high Sr 时发现109 个 Sr≥0.75 只分布在 12 个 terminal systems，其中</w:t>
-      </w:r>
-      <w:r>
-        <w:rPr>
-          <w:rFonts w:hint="eastAsia"/>
-          <w:lang w:val="en-US" w:eastAsia="zh-CN"/>
-        </w:rPr>
-        <w:t>喜马拉雅</w:t>
-      </w:r>
-      <w:r>
-        <w:rPr>
-          <w:rFonts w:hint="default"/>
-          <w:lang w:val="en-US" w:eastAsia="zh-CN"/>
-        </w:rPr>
-        <w:t>水系包含约 80 个高值。</w:t>
-      </w:r>
-      <w:r>
-        <w:rPr>
-          <w:rFonts w:hint="eastAsia"/>
-          <w:lang w:val="en-US" w:eastAsia="zh-CN"/>
-        </w:rPr>
-        <w:t>存在</w:t>
-      </w:r>
-      <w:r>
-        <w:rPr>
-          <w:rFonts w:hint="default"/>
-          <w:lang w:val="en-US" w:eastAsia="zh-CN"/>
-        </w:rPr>
-        <w:t>terminal component 把很多其实相对独立的支流合并在了一起</w:t>
-      </w:r>
-      <w:r>
-        <w:rPr>
-          <w:rFonts w:hint="eastAsia"/>
-          <w:lang w:val="en-US" w:eastAsia="zh-CN"/>
-        </w:rPr>
-        <w:t>的情况。</w:t>
-      </w:r>
-    </w:p>
-    <w:p>
-      <w:pPr>
-        <w:widowControl w:val="0"/>
-        <w:numPr>
-          <w:ilvl w:val="0"/>
-          <w:numId w:val="0"/>
-        </w:numPr>
-        <w:tabs>
-          <w:tab w:val="left" w:pos="697"/>
-        </w:tabs>
-        <w:jc w:val="both"/>
-        <w:rPr>
-          <w:rFonts w:hint="default"/>
-          <w:lang w:val="en-US" w:eastAsia="zh-CN"/>
-        </w:rPr>
-      </w:pPr>
-    </w:p>
-    <w:p>
-      <w:pPr>
-        <w:widowControl w:val="0"/>
-        <w:numPr>
-          <w:ilvl w:val="0"/>
-          <w:numId w:val="0"/>
-        </w:numPr>
-        <w:tabs>
-          <w:tab w:val="left" w:pos="697"/>
-        </w:tabs>
-        <w:jc w:val="both"/>
-        <w:rPr>
-          <w:rFonts w:hint="default"/>
-          <w:lang w:val="en-US" w:eastAsia="zh-CN"/>
-        </w:rPr>
-      </w:pPr>
-      <w:r>
-        <w:rPr>
-          <w:rFonts w:hint="default"/>
-          <w:lang w:val="en-US" w:eastAsia="zh-CN"/>
-        </w:rPr>
-        <w:t>检查 high-Sr 在大水系内部到底有多细的水文结构。把最大</w:t>
-      </w:r>
-      <w:r>
-        <w:rPr>
-          <w:rFonts w:hint="eastAsia"/>
-          <w:lang w:val="en-US" w:eastAsia="zh-CN"/>
-        </w:rPr>
-        <w:t>的</w:t>
-      </w:r>
-      <w:r>
-        <w:rPr>
-          <w:rFonts w:hint="default"/>
-          <w:lang w:val="en-US" w:eastAsia="zh-CN"/>
-        </w:rPr>
-        <w:t>往下拆</w:t>
-      </w:r>
-      <w:r>
-        <w:rPr>
-          <w:rFonts w:hint="eastAsia"/>
-          <w:lang w:val="en-US" w:eastAsia="zh-CN"/>
-        </w:rPr>
-        <w:t>喜马拉雅</w:t>
-      </w:r>
-      <w:r>
-        <w:rPr>
-          <w:rFonts w:hint="default"/>
-          <w:lang w:val="en-US" w:eastAsia="zh-CN"/>
-        </w:rPr>
-        <w:t xml:space="preserve">水系到 L6、L12 和 HydroRIVERS reach，并检查站点之间上下游拓扑关系。结果发现那 80 个 high-Sr 站点实际上分布在 10 个 L6、54 个 L12、70 个河段；还能找到 </w:t>
+        <w:t>1）Base V1的Primary验证使用完整terminal hydrological component分组，也就是测试某个水系时，将整个连通大水系移出训练集。这样可以防止同一水系上下游信息泄漏并测试跨完整水系泛化；Base V0的Primary则是1,000 km spatial CV。研究high Sr时发现，109个Sr≥0.75站点只分布在12个terminal systems，其中喜马拉雅水系包含约80个高值，terminal component可能把多个相对独立的支流合并在一起。</w:t>
+      </w:r>
+    </w:p>
+    <w:p>
+      <w:pPr>
+        <w:widowControl w:val="0"/>
+        <w:numPr>
+          <w:ilvl w:val="0"/>
+          <w:numId w:val="0"/>
+        </w:numPr>
+        <w:tabs>
+          <w:tab w:val="left" w:pos="697"/>
+        </w:tabs>
+        <w:jc w:val="both"/>
+        <w:rPr>
+          <w:rFonts w:hint="default"/>
+          <w:lang w:val="en-US" w:eastAsia="zh-CN"/>
+        </w:rPr>
+      </w:pPr>
+    </w:p>
+    <w:p>
+      <w:pPr>
+        <w:widowControl w:val="0"/>
+        <w:numPr>
+          <w:ilvl w:val="0"/>
+          <w:numId w:val="0"/>
+        </w:numPr>
+        <w:tabs>
+          <w:tab w:val="left" w:pos="697"/>
+        </w:tabs>
+        <w:jc w:val="both"/>
+        <w:rPr>
+          <w:rFonts w:hint="default"/>
+          <w:lang w:val="en-US" w:eastAsia="zh-CN"/>
+        </w:rPr>
+      </w:pPr>
+      <w:r>
+        <w:t>早期拓扑探索记录（非正式验收指标）将喜马拉雅水系拆分到L6、L12和HydroRIVERS reach，并检查上下游关系：80个high-Sr站点分布在10个L6、54个L12和70个河段；其中可识别28个独立L12和48个独立河段。这支持把问题进一步定义为新支流泛化。</w:t>
+      </w:r>
+    </w:p>
+    <w:p>
+      <w:pPr>
+        <w:widowControl w:val="0"/>
+        <w:numPr>
+          <w:ilvl w:val="0"/>
+          <w:numId w:val="0"/>
+        </w:numPr>
+        <w:tabs>
+          <w:tab w:val="left" w:pos="697"/>
+        </w:tabs>
+        <w:jc w:val="both"/>
+        <w:rPr>
+          <w:rFonts w:hint="default"/>
+          <w:lang w:val="en-US" w:eastAsia="zh-CN"/>
+        </w:rPr>
+      </w:pPr>
+    </w:p>
+    <w:p>
+      <w:pPr>
+        <w:widowControl w:val="0"/>
+        <w:numPr>
+          <w:ilvl w:val="0"/>
+          <w:numId w:val="0"/>
+        </w:numPr>
+        <w:tabs>
+          <w:tab w:val="left" w:pos="697"/>
+        </w:tabs>
+        <w:jc w:val="both"/>
+        <w:rPr>
+          <w:rFonts w:hint="default"/>
+          <w:lang w:val="en-US" w:eastAsia="zh-CN"/>
+        </w:rPr>
+      </w:pPr>
+      <w:r>
+        <w:rPr>
+          <w:rFonts w:hint="eastAsia"/>
+          <w:lang w:val="en-US" w:eastAsia="zh-CN"/>
+        </w:rPr>
+      </w:r>
+      <w:r>
+        <w:rPr>
+          <w:rFonts w:hint="default"/>
+          <w:lang w:val="en-US" w:eastAsia="zh-CN"/>
+        </w:rPr>
+      </w:r>
+      <w:r>
+        <w:rPr>
+          <w:rFonts w:hint="eastAsia"/>
+          <w:lang w:val="en-US" w:eastAsia="zh-CN"/>
+        </w:rPr>
+      </w:r>
+      <w:r>
+        <w:rPr>
+          <w:rFonts w:hint="default"/>
+          <w:lang w:val="en-US" w:eastAsia="zh-CN"/>
+        </w:rPr>
       </w:r>
       <w:r>
         <w:rPr>
@@ -5745,7 +5695,19 @@
           <w:highlight w:val="cyan"/>
           <w:lang w:val="en-US" w:eastAsia="zh-CN"/>
         </w:rPr>
-        <w:t>28 个</w:t>
+      </w:r>
+      <w:r>
+        <w:rPr>
+          <w:rFonts w:hint="default"/>
+          <w:lang w:val="en-US" w:eastAsia="zh-CN"/>
+        </w:rPr>
+      </w:r>
+      <w:r>
+        <w:rPr>
+          <w:rFonts w:hint="eastAsia"/>
+          <w:lang w:val="en-US" w:eastAsia="zh-CN"/>
+        </w:rPr>
+        <w:t>2）正式构建 Branch-Purged CV，并用</w:t>
       </w:r>
       <w:r>
         <w:rPr>
@@ -5753,7 +5715,37 @@
           <w:highlight w:val="cyan"/>
           <w:lang w:val="en-US" w:eastAsia="zh-CN"/>
         </w:rPr>
-        <w:t>独立</w:t>
+        <w:t>冻结 Base 做公平对照</w:t>
+      </w:r>
+      <w:r>
+        <w:rPr>
+          <w:rFonts w:hint="eastAsia"/>
+          <w:lang w:val="en-US" w:eastAsia="zh-CN"/>
+        </w:rPr>
+        <w:t>。</w:t>
+      </w:r>
+    </w:p>
+    <w:p>
+      <w:pPr>
+        <w:widowControl w:val="0"/>
+        <w:numPr>
+          <w:ilvl w:val="0"/>
+          <w:numId w:val="0"/>
+        </w:numPr>
+        <w:tabs>
+          <w:tab w:val="left" w:pos="697"/>
+        </w:tabs>
+        <w:jc w:val="both"/>
+        <w:rPr>
+          <w:rFonts w:hint="default"/>
+          <w:lang w:val="en-US" w:eastAsia="zh-CN"/>
+        </w:rPr>
+      </w:pPr>
+      <w:r>
+        <w:rPr>
+          <w:rFonts w:hint="default"/>
+          <w:lang w:val="en-US" w:eastAsia="zh-CN"/>
+        </w:rPr>
       </w:r>
       <w:r>
         <w:rPr>
@@ -5761,187 +5753,26 @@
           <w:highlight w:val="cyan"/>
           <w:lang w:val="en-US" w:eastAsia="zh-CN"/>
         </w:rPr>
-        <w:t>的 L12 和 48 个</w:t>
-      </w:r>
-      <w:r>
-        <w:rPr>
-          <w:rFonts w:hint="eastAsia"/>
+      </w:r>
+      <w:r>
+        <w:rPr>
+          <w:rFonts w:hint="default"/>
+          <w:lang w:val="en-US" w:eastAsia="zh-CN"/>
+        </w:rPr>
+      </w:r>
+      <w:r>
+        <w:rPr>
+          <w:rFonts w:hint="default"/>
+          <w:lang w:val="en-US" w:eastAsia="zh-CN"/>
+        </w:rPr>
+        <w:t xml:space="preserve">Base V2 构建了 </w:t>
+      </w:r>
+      <w:r>
+        <w:rPr>
+          <w:rFonts w:hint="default"/>
           <w:highlight w:val="cyan"/>
           <w:lang w:val="en-US" w:eastAsia="zh-CN"/>
         </w:rPr>
-        <w:t>独立</w:t>
-      </w:r>
-      <w:r>
-        <w:rPr>
-          <w:rFonts w:hint="default"/>
-          <w:highlight w:val="cyan"/>
-          <w:lang w:val="en-US" w:eastAsia="zh-CN"/>
-        </w:rPr>
-        <w:t>的河段。</w:t>
-      </w:r>
-      <w:r>
-        <w:rPr>
-          <w:rFonts w:hint="default"/>
-          <w:lang w:val="en-US" w:eastAsia="zh-CN"/>
-        </w:rPr>
-        <w:t>可以把 terminal component 拆细，</w:t>
-      </w:r>
-      <w:r>
-        <w:rPr>
-          <w:rFonts w:hint="eastAsia"/>
-          <w:lang w:val="en-US" w:eastAsia="zh-CN"/>
-        </w:rPr>
-        <w:t>问题定义为</w:t>
-      </w:r>
-      <w:r>
-        <w:rPr>
-          <w:rFonts w:hint="default"/>
-          <w:lang w:val="en-US" w:eastAsia="zh-CN"/>
-        </w:rPr>
-        <w:t>预测新支流</w:t>
-      </w:r>
-    </w:p>
-    <w:p>
-      <w:pPr>
-        <w:widowControl w:val="0"/>
-        <w:numPr>
-          <w:ilvl w:val="0"/>
-          <w:numId w:val="0"/>
-        </w:numPr>
-        <w:tabs>
-          <w:tab w:val="left" w:pos="697"/>
-        </w:tabs>
-        <w:jc w:val="both"/>
-        <w:rPr>
-          <w:rFonts w:hint="default"/>
-          <w:lang w:val="en-US" w:eastAsia="zh-CN"/>
-        </w:rPr>
-      </w:pPr>
-    </w:p>
-    <w:p>
-      <w:pPr>
-        <w:widowControl w:val="0"/>
-        <w:numPr>
-          <w:ilvl w:val="0"/>
-          <w:numId w:val="0"/>
-        </w:numPr>
-        <w:tabs>
-          <w:tab w:val="left" w:pos="697"/>
-        </w:tabs>
-        <w:jc w:val="both"/>
-        <w:rPr>
-          <w:rFonts w:hint="default"/>
-          <w:lang w:val="en-US" w:eastAsia="zh-CN"/>
-        </w:rPr>
-      </w:pPr>
-      <w:r>
-        <w:rPr>
-          <w:rFonts w:hint="eastAsia"/>
-          <w:lang w:val="en-US" w:eastAsia="zh-CN"/>
-        </w:rPr>
-      </w:r>
-      <w:r>
-        <w:rPr>
-          <w:rFonts w:hint="default"/>
-          <w:lang w:val="en-US" w:eastAsia="zh-CN"/>
-        </w:rPr>
-      </w:r>
-      <w:r>
-        <w:rPr>
-          <w:rFonts w:hint="eastAsia"/>
-          <w:lang w:val="en-US" w:eastAsia="zh-CN"/>
-        </w:rPr>
-      </w:r>
-      <w:r>
-        <w:rPr>
-          <w:rFonts w:hint="default"/>
-          <w:lang w:val="en-US" w:eastAsia="zh-CN"/>
-        </w:rPr>
-      </w:r>
-      <w:r>
-        <w:rPr>
-          <w:rFonts w:hint="default"/>
-          <w:highlight w:val="cyan"/>
-          <w:lang w:val="en-US" w:eastAsia="zh-CN"/>
-        </w:rPr>
-      </w:r>
-      <w:r>
-        <w:rPr>
-          <w:rFonts w:hint="default"/>
-          <w:lang w:val="en-US" w:eastAsia="zh-CN"/>
-        </w:rPr>
-      </w:r>
-      <w:r>
-        <w:rPr>
-          <w:rFonts w:hint="eastAsia"/>
-          <w:lang w:val="en-US" w:eastAsia="zh-CN"/>
-        </w:rPr>
-        <w:t>2）正式构建 Branch-Purged CV，并用</w:t>
-      </w:r>
-      <w:r>
-        <w:rPr>
-          <w:rFonts w:hint="eastAsia"/>
-          <w:highlight w:val="cyan"/>
-          <w:lang w:val="en-US" w:eastAsia="zh-CN"/>
-        </w:rPr>
-        <w:t>冻结 Base 做公平对照</w:t>
-      </w:r>
-      <w:r>
-        <w:rPr>
-          <w:rFonts w:hint="eastAsia"/>
-          <w:lang w:val="en-US" w:eastAsia="zh-CN"/>
-        </w:rPr>
-        <w:t>。</w:t>
-      </w:r>
-    </w:p>
-    <w:p>
-      <w:pPr>
-        <w:widowControl w:val="0"/>
-        <w:numPr>
-          <w:ilvl w:val="0"/>
-          <w:numId w:val="0"/>
-        </w:numPr>
-        <w:tabs>
-          <w:tab w:val="left" w:pos="697"/>
-        </w:tabs>
-        <w:jc w:val="both"/>
-        <w:rPr>
-          <w:rFonts w:hint="default"/>
-          <w:lang w:val="en-US" w:eastAsia="zh-CN"/>
-        </w:rPr>
-      </w:pPr>
-      <w:r>
-        <w:rPr>
-          <w:rFonts w:hint="default"/>
-          <w:lang w:val="en-US" w:eastAsia="zh-CN"/>
-        </w:rPr>
-      </w:r>
-      <w:r>
-        <w:rPr>
-          <w:rFonts w:hint="default"/>
-          <w:highlight w:val="cyan"/>
-          <w:lang w:val="en-US" w:eastAsia="zh-CN"/>
-        </w:rPr>
-      </w:r>
-      <w:r>
-        <w:rPr>
-          <w:rFonts w:hint="default"/>
-          <w:lang w:val="en-US" w:eastAsia="zh-CN"/>
-        </w:rPr>
-      </w:r>
-      <w:r>
-        <w:rPr>
-          <w:rFonts w:hint="default"/>
-          <w:lang w:val="en-US" w:eastAsia="zh-CN"/>
-        </w:rPr>
-        <w:t xml:space="preserve">Base V2 构建了 </w:t>
-      </w:r>
-      <w:r>
-        <w:rPr>
-          <w:rFonts w:hint="default"/>
-          <w:highlight w:val="cyan"/>
-          <w:lang w:val="en-US" w:eastAsia="zh-CN"/>
-        </w:rPr>
         <w:t>221 个 branch，覆盖 2,577 / 4,485 个 stations</w:t>
       </w:r>
       <w:r>
@@ -6126,52 +5957,44 @@
         </w:rPr>
       </w:pPr>
       <w:r>
-        <w:rPr>
-          <w:rFonts w:hint="default"/>
-          <w:lang w:val="en-US" w:eastAsia="zh-CN"/>
-        </w:rPr>
-        <w:t>而真实 downstream purge 相比 naive/placebo 只造成很小性能损失。</w:t>
-      </w:r>
-    </w:p>
-    <w:p>
-      <w:pPr>
-        <w:widowControl w:val="0"/>
-        <w:numPr>
-          <w:ilvl w:val="0"/>
-          <w:numId w:val="0"/>
-        </w:numPr>
-        <w:tabs>
-          <w:tab w:val="left" w:pos="697"/>
-        </w:tabs>
-        <w:jc w:val="both"/>
-        <w:rPr>
-          <w:rFonts w:hint="default"/>
-          <w:lang w:val="en-US" w:eastAsia="zh-CN"/>
-        </w:rPr>
-      </w:pPr>
-    </w:p>
-    <w:p>
-      <w:pPr>
-        <w:widowControl w:val="0"/>
-        <w:numPr>
-          <w:ilvl w:val="0"/>
-          <w:numId w:val="0"/>
-        </w:numPr>
-        <w:tabs>
-          <w:tab w:val="left" w:pos="697"/>
-        </w:tabs>
-        <w:jc w:val="both"/>
-        <w:rPr>
-          <w:rFonts w:hint="default"/>
-          <w:lang w:val="en-US" w:eastAsia="zh-CN"/>
-        </w:rPr>
-      </w:pPr>
-      <w:r>
-        <w:rPr>
-          <w:rFonts w:hint="default"/>
-          <w:lang w:val="en-US" w:eastAsia="zh-CN"/>
-        </w:rPr>
-        <w:t>证明过去的 CV 低估了 Base 的现实支流泛化能力，并没有解决真正的 extreme-Sr 建模问题。</w:t>
+        <w:t>在primary_s05中，真实downstream purge相对naive branch的代价约为RMSE 2.5%、MAE 5.8%和branch-macro RMSE 2.7%，同时Sr≥0.75绝对bias略有改善；保留purge是为了严格拓扑隔离，而不是因为它必然提高预测性能。</w:t>
+      </w:r>
+    </w:p>
+    <w:p>
+      <w:pPr>
+        <w:widowControl w:val="0"/>
+        <w:numPr>
+          <w:ilvl w:val="0"/>
+          <w:numId w:val="0"/>
+        </w:numPr>
+        <w:tabs>
+          <w:tab w:val="left" w:pos="697"/>
+        </w:tabs>
+        <w:jc w:val="both"/>
+        <w:rPr>
+          <w:rFonts w:hint="default"/>
+          <w:lang w:val="en-US" w:eastAsia="zh-CN"/>
+        </w:rPr>
+      </w:pPr>
+    </w:p>
+    <w:p>
+      <w:pPr>
+        <w:widowControl w:val="0"/>
+        <w:numPr>
+          <w:ilvl w:val="0"/>
+          <w:numId w:val="0"/>
+        </w:numPr>
+        <w:tabs>
+          <w:tab w:val="left" w:pos="697"/>
+        </w:tabs>
+        <w:jc w:val="both"/>
+        <w:rPr>
+          <w:rFonts w:hint="default"/>
+          <w:lang w:val="en-US" w:eastAsia="zh-CN"/>
+        </w:rPr>
+      </w:pPr>
+      <w:r>
+        <w:t>结果支持terminal-component CV对新支流泛化较为保守；拆分到Purged Branch后总体指标改善，但真正的extreme-Sr建模问题仍未解决。</w:t>
       </w:r>
     </w:p>
     <w:p>
@@ -11750,11 +11573,7 @@
         </w:rPr>
       </w:pPr>
       <w:r>
-        <w:rPr>
-          <w:rFonts w:hint="eastAsia"/>
-          <w:lang w:val="en-US" w:eastAsia="zh-CN"/>
-        </w:rPr>
-        <w:t>进一步优化gam，验证gate资质</w:t>
+        <w:t>冻结V1的GAM结构与两个候选，不重新调优GAM；下一步只验证calibration与operational Gate资质。</w:t>
       </w:r>
     </w:p>
     <w:p>
@@ -12077,107 +11896,87 @@
         </w:rPr>
       </w:pPr>
       <w:r>
-        <w:rPr>
-          <w:rFonts w:hint="eastAsia"/>
-          <w:lang w:val="en-US" w:eastAsia="zh-CN"/>
-        </w:rPr>
-        <w:t>Outer：完整留出1个 branch</w:t>
-      </w:r>
-    </w:p>
-    <w:p>
-      <w:pPr>
-        <w:widowControl w:val="0"/>
-        <w:numPr>
-          <w:ilvl w:val="0"/>
-          <w:numId w:val="0"/>
-        </w:numPr>
-        <w:tabs>
-          <w:tab w:val="left" w:pos="697"/>
-        </w:tabs>
-        <w:jc w:val="both"/>
-        <w:rPr>
-          <w:rFonts w:hint="eastAsia"/>
-          <w:lang w:val="en-US" w:eastAsia="zh-CN"/>
-        </w:rPr>
-      </w:pPr>
-      <w:r>
-        <w:rPr>
-          <w:rFonts w:hint="eastAsia"/>
-          <w:lang w:val="en-US" w:eastAsia="zh-CN"/>
-        </w:rPr>
-        <w:t>Inner：在剩余16个 branch 内进行 LOBO</w:t>
-      </w:r>
-    </w:p>
-    <w:p>
-      <w:pPr>
-        <w:widowControl w:val="0"/>
-        <w:numPr>
-          <w:ilvl w:val="0"/>
-          <w:numId w:val="0"/>
-        </w:numPr>
-        <w:tabs>
-          <w:tab w:val="left" w:pos="697"/>
-        </w:tabs>
-        <w:jc w:val="both"/>
-        <w:rPr>
-          <w:rFonts w:hint="eastAsia"/>
-          <w:lang w:val="en-US" w:eastAsia="zh-CN"/>
-        </w:rPr>
-      </w:pPr>
-      <w:r>
-        <w:rPr>
-          <w:rFonts w:hint="eastAsia"/>
-          <w:lang w:val="en-US" w:eastAsia="zh-CN"/>
-        </w:rPr>
-        <w:t>Inner OOF 用于概率校准和阈值选择</w:t>
-      </w:r>
-    </w:p>
-    <w:p>
-      <w:pPr>
-        <w:widowControl w:val="0"/>
-        <w:numPr>
-          <w:ilvl w:val="0"/>
-          <w:numId w:val="0"/>
-        </w:numPr>
-        <w:tabs>
-          <w:tab w:val="left" w:pos="697"/>
-        </w:tabs>
-        <w:jc w:val="both"/>
-        <w:rPr>
-          <w:rFonts w:hint="eastAsia"/>
-          <w:lang w:val="en-US" w:eastAsia="zh-CN"/>
-        </w:rPr>
-      </w:pPr>
-      <w:r>
-        <w:rPr>
-          <w:rFonts w:hint="eastAsia"/>
-          <w:lang w:val="en-US" w:eastAsia="zh-CN"/>
-        </w:rPr>
-        <w:t>Outer branch 仅用于最终测试</w:t>
-      </w:r>
-    </w:p>
-    <w:p>
-      <w:pPr>
-        <w:widowControl w:val="0"/>
-        <w:numPr>
-          <w:ilvl w:val="0"/>
-          <w:numId w:val="0"/>
-        </w:numPr>
-        <w:tabs>
-          <w:tab w:val="left" w:pos="697"/>
-        </w:tabs>
-        <w:jc w:val="both"/>
-        <w:rPr>
-          <w:rFonts w:hint="eastAsia"/>
-          <w:lang w:val="en-US" w:eastAsia="zh-CN"/>
-        </w:rPr>
-      </w:pPr>
-      <w:r>
-        <w:rPr>
-          <w:rFonts w:hint="eastAsia"/>
-          <w:lang w:val="en-US" w:eastAsia="zh-CN"/>
-        </w:rPr>
-        <w:t>3.结果</w:t>
+        <w:t>Outer：完整留出1个branch，共17个Outer folds。</w:t>
+      </w:r>
+    </w:p>
+    <w:p>
+      <w:pPr>
+        <w:widowControl w:val="0"/>
+        <w:numPr>
+          <w:ilvl w:val="0"/>
+          <w:numId w:val="0"/>
+        </w:numPr>
+        <w:tabs>
+          <w:tab w:val="left" w:pos="697"/>
+        </w:tabs>
+        <w:jc w:val="both"/>
+        <w:rPr>
+          <w:rFonts w:hint="eastAsia"/>
+          <w:lang w:val="en-US" w:eastAsia="zh-CN"/>
+        </w:rPr>
+      </w:pPr>
+      <w:r>
+        <w:t>Inner：在剩余16个branches内执行exhaustive LOBO。</w:t>
+      </w:r>
+    </w:p>
+    <w:p>
+      <w:pPr>
+        <w:widowControl w:val="0"/>
+        <w:numPr>
+          <w:ilvl w:val="0"/>
+          <w:numId w:val="0"/>
+        </w:numPr>
+        <w:tabs>
+          <w:tab w:val="left" w:pos="697"/>
+        </w:tabs>
+        <w:jc w:val="both"/>
+        <w:rPr>
+          <w:rFonts w:hint="eastAsia"/>
+          <w:lang w:val="en-US" w:eastAsia="zh-CN"/>
+        </w:rPr>
+      </w:pPr>
+      <w:r>
+        <w:t>Inner OOF用于branch-sqrt-weighted Platt calibration和inner-only threshold selection；Primary背景FPR上限为10%，5% Strict Gate仅作压力诊断。</w:t>
+      </w:r>
+    </w:p>
+    <w:p>
+      <w:pPr>
+        <w:widowControl w:val="0"/>
+        <w:numPr>
+          <w:ilvl w:val="0"/>
+          <w:numId w:val="0"/>
+        </w:numPr>
+        <w:tabs>
+          <w:tab w:val="left" w:pos="697"/>
+        </w:tabs>
+        <w:jc w:val="both"/>
+        <w:rPr>
+          <w:rFonts w:hint="eastAsia"/>
+          <w:lang w:val="en-US" w:eastAsia="zh-CN"/>
+        </w:rPr>
+      </w:pPr>
+      <w:r>
+        <w:t>Outer branch仅用于最终测试。Primary资格还要求Recall≥50%、Precision≥30%、positive-branch coverage≥50%和extreme-branch coverage≥75%。</w:t>
+      </w:r>
+    </w:p>
+    <w:p>
+      <w:pPr>
+        <w:widowControl w:val="0"/>
+        <w:numPr>
+          <w:ilvl w:val="0"/>
+          <w:numId w:val="0"/>
+        </w:numPr>
+        <w:tabs>
+          <w:tab w:val="left" w:pos="697"/>
+        </w:tabs>
+        <w:jc w:val="both"/>
+        <w:rPr>
+          <w:rFonts w:hint="eastAsia"/>
+          <w:lang w:val="en-US" w:eastAsia="zh-CN"/>
+        </w:rPr>
+      </w:pPr>
+      <w:r>
+        <w:t>3.结果（Gate表中的station-level FPR、Recall与Precision均为branch-sqrt weighted；branch/system coverage为计数）</w:t>
       </w:r>
     </w:p>
     <w:p>
@@ -13028,11 +12827,7 @@
         </w:rPr>
       </w:pPr>
       <w:r>
-        <w:rPr>
-          <w:rFonts w:hint="default"/>
-          <w:lang w:val="en-US" w:eastAsia="zh-CN"/>
-        </w:rPr>
-        <w:t>5% strict Gate</w:t>
+        <w:t>5% Strict diagnostic Gate（不参与Primary qualification）</w:t>
       </w:r>
     </w:p>
     <w:p>
@@ -13593,26 +13388,7 @@
         </w:rPr>
       </w:pPr>
       <w:r>
-        <w:rPr>
-          <w:rFonts w:hint="eastAsia"/>
-          <w:lang w:val="en-US" w:eastAsia="zh-CN"/>
-        </w:rPr>
-        <w:t>采用严格 LOBO 验证，</w:t>
-      </w:r>
-      <w:r>
-        <w:rPr>
-          <w:rFonts w:hint="eastAsia"/>
-          <w:highlight w:val="cyan"/>
-          <w:lang w:val="en-US" w:eastAsia="zh-CN"/>
-        </w:rPr>
-        <w:t>17个branch× 2种算法× 2套特征= 68个 Outer 任务</w:t>
-      </w:r>
-      <w:r>
-        <w:rPr>
-          <w:rFonts w:hint="eastAsia"/>
-          <w:lang w:val="en-US" w:eastAsia="zh-CN"/>
-        </w:rPr>
-        <w:t>。</w:t>
+        <w:t>采用Strict Nested LOBO：17个Outer branches，每个Outer task在其余16个branches内执行exhaustive Inner LOBO；threshold仅由Inner OOF在branch-sqrt-weighted背景FPR≤10%约束下选择，calibration为none。17 branches × 2种算法 × 2套特征=68个Outer任务，共1,156次模型拟合、68个thresholds和1,488条Outer OOF predictions。</w:t>
       </w:r>
     </w:p>
     <w:p>
@@ -13656,12 +13432,7 @@
         </w:rPr>
       </w:pPr>
       <w:r>
-        <w:rPr>
-          <w:rFonts w:hint="eastAsia"/>
-          <w:highlight w:val="cyan"/>
-          <w:lang w:val="en-US" w:eastAsia="zh-CN"/>
-        </w:rPr>
-        <w:t>RF Full50    RF Full50 + Process14    XGBoost Full50   XGBoost Full50 + Process14</w:t>
+        <w:t>Probability RF Full50    Probability RF Full50 + Process14    固定浅层XGBoost Full50    固定浅层XGBoost Full50 + Process14</w:t>
       </w:r>
     </w:p>
     <w:p>
@@ -13859,11 +13630,7 @@
         </w:rPr>
       </w:pPr>
       <w:r>
-        <w:rPr>
-          <w:rFonts w:hint="eastAsia"/>
-          <w:lang w:val="en-US" w:eastAsia="zh-CN"/>
-        </w:rPr>
-        <w:t>3.结果</w:t>
+        <w:t>3.结果（Gate表中的station-level FPR、Recall与Precision均为branch-sqrt weighted；branch/system coverage为计数）</w:t>
       </w:r>
     </w:p>
     <w:tbl>
@@ -15021,39 +14788,7 @@
         </w:rPr>
       </w:pPr>
       <w:r>
-        <w:rPr>
-          <w:rFonts w:hint="default"/>
-          <w:lang w:val="en-US" w:eastAsia="zh-CN"/>
-        </w:rPr>
-      </w:r>
-      <w:r>
-        <w:rPr>
-          <w:rFonts w:hint="default"/>
-          <w:highlight w:val="yellow"/>
-          <w:lang w:val="en-US" w:eastAsia="zh-CN"/>
-        </w:rPr>
-      </w:r>
-      <w:r>
-        <w:rPr>
-          <w:rFonts w:hint="default"/>
-          <w:lang w:val="en-US" w:eastAsia="zh-CN"/>
-        </w:rPr>
-        <w:t>四个候选均未通过完整 Gate；现阶段只能确认算法复杂度和 Process14 增补</w:t>
-      </w:r>
-      <w:r>
-        <w:rPr>
-          <w:rFonts w:hint="default"/>
-          <w:highlight w:val="yellow"/>
-          <w:lang w:val="en-US" w:eastAsia="zh-CN"/>
-        </w:rPr>
-        <w:t>不足以形成可用 Regional Risk Gate</w:t>
-      </w:r>
-      <w:r>
-        <w:rPr>
-          <w:rFonts w:hint="default"/>
-          <w:lang w:val="en-US" w:eastAsia="zh-CN"/>
-        </w:rPr>
-        <w:t>，不提前归因于特征信息缺口。</w:t>
+        <w:t>四个候选均未通过完整Gate。在随后进行Failure Audit之前，V2主实验本身只确认算法复杂度和Process14增补不足以形成可用Regional Risk Gate，不直接把失败归因于特征信息缺口。</w:t>
       </w:r>
     </w:p>
     <w:p>

</xml_diff>